<commit_message>
added code link in the documentation
</commit_message>
<xml_diff>
--- a/documentation/Smart Radai - Documentation.docx
+++ b/documentation/Smart Radai - Documentation.docx
@@ -3819,8 +3819,8 @@
         <w:pStyle w:val="2"/>
         <w:jc w:val="center"/>
       </w:pPr>
-      <w:bookmarkStart w:id="0" w:name="_Toc177830816"/>
-      <w:bookmarkStart w:id="1" w:name="_Toc768174515"/>
+      <w:bookmarkStart w:id="0" w:name="_Toc768174515"/>
+      <w:bookmarkStart w:id="1" w:name="_Toc177830816"/>
       <w:r>
         <w:t>Abstract:</w:t>
       </w:r>
@@ -4009,8 +4009,8 @@
           <w:lang w:val="en-US"/>
         </w:rPr>
       </w:pPr>
-      <w:bookmarkStart w:id="4" w:name="_Toc1772898578"/>
-      <w:bookmarkStart w:id="5" w:name="_Toc177830818"/>
+      <w:bookmarkStart w:id="4" w:name="_Toc177830818"/>
+      <w:bookmarkStart w:id="5" w:name="_Toc1772898578"/>
       <w:r>
         <w:rPr>
           <w:lang w:val="en-US"/>
@@ -4059,8 +4059,8 @@
           <w:lang w:val="en-US"/>
         </w:rPr>
       </w:pPr>
-      <w:bookmarkStart w:id="6" w:name="_Toc368160708"/>
-      <w:bookmarkStart w:id="7" w:name="_Toc177830819"/>
+      <w:bookmarkStart w:id="6" w:name="_Toc177830819"/>
+      <w:bookmarkStart w:id="7" w:name="_Toc368160708"/>
       <w:r>
         <w:rPr>
           <w:lang w:val="en-US"/>
@@ -5816,8 +5816,8 @@
           <w:lang w:val="en-US"/>
         </w:rPr>
       </w:pPr>
-      <w:bookmarkStart w:id="24" w:name="_Toc1809496020"/>
-      <w:bookmarkStart w:id="25" w:name="_Toc177830828"/>
+      <w:bookmarkStart w:id="24" w:name="_Toc177830828"/>
+      <w:bookmarkStart w:id="25" w:name="_Toc1809496020"/>
       <w:r>
         <w:rPr>
           <w:lang w:val="en-US"/>
@@ -8779,8 +8779,8 @@
           <w:lang w:val="en-US"/>
         </w:rPr>
       </w:pPr>
-      <w:bookmarkStart w:id="30" w:name="_Toc467496823"/>
-      <w:bookmarkStart w:id="31" w:name="_Toc177830831"/>
+      <w:bookmarkStart w:id="30" w:name="_Toc177830831"/>
+      <w:bookmarkStart w:id="31" w:name="_Toc467496823"/>
       <w:r>
         <w:rPr>
           <w:sz w:val="144"/>
@@ -8846,8 +8846,8 @@
           <w:lang w:val="en-US"/>
         </w:rPr>
       </w:pPr>
-      <w:bookmarkStart w:id="32" w:name="_Toc1480398397"/>
-      <w:bookmarkStart w:id="33" w:name="_Toc177830832"/>
+      <w:bookmarkStart w:id="32" w:name="_Toc177830832"/>
+      <w:bookmarkStart w:id="33" w:name="_Toc1480398397"/>
       <w:r>
         <w:rPr>
           <w:lang w:val="en-US"/>
@@ -9102,8 +9102,8 @@
           <w:lang w:val="en-US"/>
         </w:rPr>
       </w:pPr>
-      <w:bookmarkStart w:id="36" w:name="_Toc177830834"/>
-      <w:bookmarkStart w:id="37" w:name="_Toc213148782"/>
+      <w:bookmarkStart w:id="36" w:name="_Toc213148782"/>
+      <w:bookmarkStart w:id="37" w:name="_Toc177830834"/>
       <w:r>
         <w:rPr>
           <w:lang w:val="en-US"/>
@@ -10590,8 +10590,8 @@
           <w:lang w:val="en-US"/>
         </w:rPr>
       </w:pPr>
-      <w:bookmarkStart w:id="42" w:name="_Toc2037200846"/>
-      <w:bookmarkStart w:id="43" w:name="_Toc177830837"/>
+      <w:bookmarkStart w:id="42" w:name="_Toc177830837"/>
+      <w:bookmarkStart w:id="43" w:name="_Toc2037200846"/>
       <w:r>
         <w:rPr>
           <w:lang w:val="en-US"/>
@@ -11674,8 +11674,8 @@
           <w:lang w:val="en-US"/>
         </w:rPr>
       </w:pPr>
-      <w:bookmarkStart w:id="52" w:name="_Toc177830842"/>
-      <w:bookmarkStart w:id="53" w:name="_Toc897582999"/>
+      <w:bookmarkStart w:id="52" w:name="_Toc897582999"/>
+      <w:bookmarkStart w:id="53" w:name="_Toc177830842"/>
       <w:r>
         <w:rPr>
           <w:lang w:val="en-US"/>
@@ -13268,8 +13268,8 @@
           <w:lang w:val="en-US"/>
         </w:rPr>
       </w:pPr>
-      <w:bookmarkStart w:id="56" w:name="_Toc1696880242"/>
-      <w:bookmarkStart w:id="57" w:name="_Toc177830844"/>
+      <w:bookmarkStart w:id="56" w:name="_Toc177830844"/>
+      <w:bookmarkStart w:id="57" w:name="_Toc1696880242"/>
       <w:r>
         <w:rPr>
           <w:lang w:val="en-US"/>
@@ -14160,8 +14160,8 @@
           <w:lang w:val="en-US"/>
         </w:rPr>
       </w:pPr>
-      <w:bookmarkStart w:id="60" w:name="_Toc2078215350"/>
-      <w:bookmarkStart w:id="61" w:name="_Toc177830846"/>
+      <w:bookmarkStart w:id="60" w:name="_Toc177830846"/>
+      <w:bookmarkStart w:id="61" w:name="_Toc2078215350"/>
       <w:r>
         <w:rPr>
           <w:lang w:val="en-US"/>
@@ -14769,8 +14769,8 @@
           <w:lang w:val="en-US"/>
         </w:rPr>
       </w:pPr>
-      <w:bookmarkStart w:id="62" w:name="_Toc317571109"/>
-      <w:bookmarkStart w:id="63" w:name="_Toc177830847"/>
+      <w:bookmarkStart w:id="62" w:name="_Toc177830847"/>
+      <w:bookmarkStart w:id="63" w:name="_Toc317571109"/>
       <w:r>
         <w:rPr>
           <w:lang w:val="en-US"/>
@@ -15060,8 +15060,8 @@
           <w:lang w:val="en-US"/>
         </w:rPr>
       </w:pPr>
-      <w:bookmarkStart w:id="66" w:name="_Toc177830849"/>
-      <w:bookmarkStart w:id="67" w:name="_Toc1703630280"/>
+      <w:bookmarkStart w:id="66" w:name="_Toc1703630280"/>
+      <w:bookmarkStart w:id="67" w:name="_Toc177830849"/>
       <w:r>
         <w:rPr>
           <w:lang w:val="en-US"/>
@@ -17492,8 +17492,8 @@
           <w:lang w:val="en-US"/>
         </w:rPr>
       </w:pPr>
-      <w:bookmarkStart w:id="78" w:name="_Toc875416599"/>
-      <w:bookmarkStart w:id="79" w:name="_Toc177830855"/>
+      <w:bookmarkStart w:id="78" w:name="_Toc177830855"/>
+      <w:bookmarkStart w:id="79" w:name="_Toc875416599"/>
       <w:r>
         <w:rPr>
           <w:b/>
@@ -17562,9 +17562,20 @@
         <w:outlineLvl w:val="9"/>
         <w:rPr>
           <w:rFonts w:hint="default"/>
-          <w:lang w:val="en-US"/>
-        </w:rPr>
-      </w:pPr>
+          <w:b/>
+          <w:bCs/>
+          <w:lang w:val="en-US"/>
+        </w:rPr>
+      </w:pPr>
+      <w:r>
+        <w:rPr>
+          <w:rFonts w:hint="default"/>
+          <w:b/>
+          <w:bCs/>
+          <w:lang w:val="en-US"/>
+        </w:rPr>
+        <w:t>1. Multi-Modality Escalation:</w:t>
+      </w:r>
     </w:p>
     <w:p>
       <w:pPr>
@@ -17586,19 +17597,15 @@
         <w:outlineLvl w:val="9"/>
         <w:rPr>
           <w:rFonts w:hint="default"/>
-          <w:b/>
-          <w:bCs/>
-          <w:lang w:val="en-US"/>
-        </w:rPr>
-      </w:pPr>
-      <w:r>
-        <w:rPr>
-          <w:rFonts w:hint="default"/>
-          <w:b/>
-          <w:bCs/>
-          <w:lang w:val="en-US"/>
-        </w:rPr>
-        <w:t>1. Multi-Modality Escalation:</w:t>
+          <w:lang w:val="en-US"/>
+        </w:rPr>
+      </w:pPr>
+      <w:r>
+        <w:rPr>
+          <w:rFonts w:hint="default"/>
+          <w:lang w:val="en-US"/>
+        </w:rPr>
+        <w:t xml:space="preserve">   The routing and prediction algorithms are currently tailored to X-ray workflows (CR/DX). Future work will focus on expanding the training dataset to include Computed Tomography (CT), Magnetic Resonance Imaging (MRI), and Ultrasound (US). This requires modifying the orchestrator to manage cross-modality coordination (e.g., automatically sequencing a trauma patient who requires both an abdominal CT and a chest X-ray).</w:t>
       </w:r>
     </w:p>
     <w:p>
@@ -17621,15 +17628,19 @@
         <w:outlineLvl w:val="9"/>
         <w:rPr>
           <w:rFonts w:hint="default"/>
-          <w:lang w:val="en-US"/>
-        </w:rPr>
-      </w:pPr>
-      <w:r>
-        <w:rPr>
-          <w:rFonts w:hint="default"/>
-          <w:lang w:val="en-US"/>
-        </w:rPr>
-        <w:t xml:space="preserve">   The routing and prediction algorithms are currently tailored to X-ray workflows (CR/DX). Future work will focus on expanding the training dataset to include Computed Tomography (CT), Magnetic Resonance Imaging (MRI), and Ultrasound (US). This requires modifying the orchestrator to manage cross-modality coordination (e.g., automatically sequencing a trauma patient who requires both an abdominal CT and a chest X-ray).</w:t>
+          <w:b/>
+          <w:bCs/>
+          <w:lang w:val="en-US"/>
+        </w:rPr>
+      </w:pPr>
+      <w:r>
+        <w:rPr>
+          <w:rFonts w:hint="default"/>
+          <w:b/>
+          <w:bCs/>
+          <w:lang w:val="en-US"/>
+        </w:rPr>
+        <w:t>2. Integration of Live HL7 MLLP and DICOM Sockets:</w:t>
       </w:r>
     </w:p>
     <w:p>
@@ -17652,19 +17663,15 @@
         <w:outlineLvl w:val="9"/>
         <w:rPr>
           <w:rFonts w:hint="default"/>
-          <w:b/>
-          <w:bCs/>
-          <w:lang w:val="en-US"/>
-        </w:rPr>
-      </w:pPr>
-      <w:r>
-        <w:rPr>
-          <w:rFonts w:hint="default"/>
-          <w:b/>
-          <w:bCs/>
-          <w:lang w:val="en-US"/>
-        </w:rPr>
-        <w:t>2. Integration of Live HL7 MLLP and DICOM Sockets:</w:t>
+          <w:lang w:val="en-US"/>
+        </w:rPr>
+      </w:pPr>
+      <w:r>
+        <w:rPr>
+          <w:rFonts w:hint="default"/>
+          <w:lang w:val="en-US"/>
+        </w:rPr>
+        <w:t xml:space="preserve">   To move beyond simulated file-watchers, the background handlers will be updated to host active TCP listening sockets. The HL7 Listener will run on an MLLP (Minimal Lower Layer Protocol) socket to receive live ADT/ORM messages, while the DICOM processor will operate as a standard SCP (Service Class Provider) to accept direct C-STORE operations from actual X-ray modalities.</w:t>
       </w:r>
     </w:p>
     <w:p>
@@ -17687,15 +17694,19 @@
         <w:outlineLvl w:val="9"/>
         <w:rPr>
           <w:rFonts w:hint="default"/>
-          <w:lang w:val="en-US"/>
-        </w:rPr>
-      </w:pPr>
-      <w:r>
-        <w:rPr>
-          <w:rFonts w:hint="default"/>
-          <w:lang w:val="en-US"/>
-        </w:rPr>
-        <w:t xml:space="preserve">   To move beyond simulated file-watchers, the background handlers will be updated to host active TCP listening sockets. The HL7 Listener will run on an MLLP (Minimal Lower Layer Protocol) socket to receive live ADT/ORM messages, while the DICOM processor will operate as a standard SCP (Service Class Provider) to accept direct C-STORE operations from actual X-ray modalities.</w:t>
+          <w:b/>
+          <w:bCs/>
+          <w:lang w:val="en-US"/>
+        </w:rPr>
+      </w:pPr>
+      <w:r>
+        <w:rPr>
+          <w:rFonts w:hint="default"/>
+          <w:b/>
+          <w:bCs/>
+          <w:lang w:val="en-US"/>
+        </w:rPr>
+        <w:t>3. Explainable AI (XAI) for Clinical Staff:</w:t>
       </w:r>
     </w:p>
     <w:p>
@@ -17718,19 +17729,15 @@
         <w:outlineLvl w:val="9"/>
         <w:rPr>
           <w:rFonts w:hint="default"/>
-          <w:b/>
-          <w:bCs/>
-          <w:lang w:val="en-US"/>
-        </w:rPr>
-      </w:pPr>
-      <w:r>
-        <w:rPr>
-          <w:rFonts w:hint="default"/>
-          <w:b/>
-          <w:bCs/>
-          <w:lang w:val="en-US"/>
-        </w:rPr>
-        <w:t>3. Explainable AI (XAI) for Clinical Staff:</w:t>
+          <w:lang w:val="en-US"/>
+        </w:rPr>
+      </w:pPr>
+      <w:r>
+        <w:rPr>
+          <w:rFonts w:hint="default"/>
+          <w:lang w:val="en-US"/>
+        </w:rPr>
+        <w:t xml:space="preserve">   To improve trust and adoption among radiologists and technologists, explainability components will be added to the dashboard. The interface will display a visual breakdown (e.g., utilizing SHAP values) showing exactly why a specific scan duration was predicted and why a certain room assignment was selected.</w:t>
       </w:r>
     </w:p>
     <w:p>
@@ -17753,15 +17760,19 @@
         <w:outlineLvl w:val="9"/>
         <w:rPr>
           <w:rFonts w:hint="default"/>
-          <w:lang w:val="en-US"/>
-        </w:rPr>
-      </w:pPr>
-      <w:r>
-        <w:rPr>
-          <w:rFonts w:hint="default"/>
-          <w:lang w:val="en-US"/>
-        </w:rPr>
-        <w:t xml:space="preserve">   To improve trust and adoption among radiologists and technologists, explainability components will be added to the dashboard. The interface will display a visual breakdown (e.g., utilizing SHAP values) showing exactly why a specific scan duration was predicted and why a certain room assignment was selected.</w:t>
+          <w:b/>
+          <w:bCs/>
+          <w:lang w:val="en-US"/>
+        </w:rPr>
+      </w:pPr>
+      <w:r>
+        <w:rPr>
+          <w:rFonts w:hint="default"/>
+          <w:b/>
+          <w:bCs/>
+          <w:lang w:val="en-US"/>
+        </w:rPr>
+        <w:t>4. Dynamic Continuous Learning (Feedback Loop):</w:t>
       </w:r>
     </w:p>
     <w:p>
@@ -17784,19 +17795,15 @@
         <w:outlineLvl w:val="9"/>
         <w:rPr>
           <w:rFonts w:hint="default"/>
-          <w:b/>
-          <w:bCs/>
-          <w:lang w:val="en-US"/>
-        </w:rPr>
-      </w:pPr>
-      <w:r>
-        <w:rPr>
-          <w:rFonts w:hint="default"/>
-          <w:b/>
-          <w:bCs/>
-          <w:lang w:val="en-US"/>
-        </w:rPr>
-        <w:t>4. Dynamic Continuous Learning (Feedback Loop):</w:t>
+          <w:lang w:val="en-US"/>
+        </w:rPr>
+      </w:pPr>
+      <w:r>
+        <w:rPr>
+          <w:rFonts w:hint="default"/>
+          <w:lang w:val="en-US"/>
+        </w:rPr>
+        <w:t xml:space="preserve">   By creating an automated daily cron job, the system could extract the actual scan times logged in the 'history' table, retrain the Random Forest model overnight, and serialize the updated model back to disk. This would allow the system to continuously adapt to seasonal department loads or machine hardware modifications without administrative intervention.</w:t>
       </w:r>
     </w:p>
     <w:p>
@@ -17818,37 +17825,6 @@
         <w:textAlignment w:val="auto"/>
         <w:outlineLvl w:val="9"/>
         <w:rPr>
-          <w:rFonts w:hint="default"/>
-          <w:lang w:val="en-US"/>
-        </w:rPr>
-      </w:pPr>
-      <w:r>
-        <w:rPr>
-          <w:rFonts w:hint="default"/>
-          <w:lang w:val="en-US"/>
-        </w:rPr>
-        <w:t xml:space="preserve">   By creating an automated daily cron job, the system could extract the actual scan times logged in the 'history' table, retrain the Random Forest model overnight, and serialize the updated model back to disk. This would allow the system to continuously adapt to seasonal department loads or machine hardware modifications without administrative intervention.</w:t>
-      </w:r>
-    </w:p>
-    <w:p>
-      <w:pPr>
-        <w:keepNext w:val="0"/>
-        <w:keepLines w:val="0"/>
-        <w:pageBreakBefore w:val="0"/>
-        <w:widowControl/>
-        <w:kinsoku/>
-        <w:wordWrap/>
-        <w:overflowPunct/>
-        <w:topLinePunct w:val="0"/>
-        <w:autoSpaceDE/>
-        <w:autoSpaceDN/>
-        <w:bidi w:val="0"/>
-        <w:adjustRightInd/>
-        <w:snapToGrid/>
-        <w:spacing w:after="0"/>
-        <w:textAlignment w:val="auto"/>
-        <w:outlineLvl w:val="9"/>
-        <w:rPr>
           <w:lang w:val="en-US"/>
         </w:rPr>
       </w:pPr>
@@ -19524,8 +19500,8 @@
           <w:lang w:val="en-US"/>
         </w:rPr>
       </w:pPr>
-      <w:bookmarkStart w:id="83" w:name="_Toc5306552"/>
-      <w:bookmarkStart w:id="84" w:name="_Toc177830858"/>
+      <w:bookmarkStart w:id="83" w:name="_Toc177830858"/>
+      <w:bookmarkStart w:id="84" w:name="_Toc5306552"/>
       <w:r>
         <w:rPr>
           <w:b/>
@@ -20420,8 +20396,6 @@
           <w:lang w:val="en-US"/>
         </w:rPr>
       </w:pPr>
-      <w:bookmarkStart w:id="91" w:name="_GoBack"/>
-      <w:bookmarkEnd w:id="91"/>
       <w:r>
         <w:rPr>
           <w:rFonts w:hint="default" w:asciiTheme="minorBidi" w:hAnsiTheme="minorBidi"/>
@@ -20737,12 +20711,12 @@
       </w:pPr>
       <w:r>
         <w:rPr>
-          <w:rFonts w:asciiTheme="minorBidi" w:hAnsiTheme="minorBidi"/>
+          <w:rFonts w:hint="default" w:asciiTheme="minorBidi" w:hAnsiTheme="minorBidi"/>
           <w:color w:val="FF0000"/>
           <w:szCs w:val="24"/>
           <w:lang w:val="en-US"/>
         </w:rPr>
-        <w:t>Provide links or attachments to the project's source code and its documentation.</w:t>
+        <w:t>The project source code and it’s documentation are provided on github and the link for that source is: https://github.com/D1122-dd/smartrad-ai</w:t>
       </w:r>
     </w:p>
     <w:p>
@@ -20755,8 +20729,8 @@
           <w:lang w:val="en-US"/>
         </w:rPr>
       </w:pPr>
-      <w:bookmarkStart w:id="87" w:name="_Toc997401416"/>
-      <w:bookmarkStart w:id="88" w:name="_Toc177830860"/>
+      <w:bookmarkStart w:id="87" w:name="_Toc177830860"/>
+      <w:bookmarkStart w:id="88" w:name="_Toc997401416"/>
       <w:r>
         <w:rPr>
           <w:b/>
@@ -20858,29 +20832,6 @@
           <w:lang w:val="en-US"/>
         </w:rPr>
         <w:t>2. Open the Project folder in a Text Editor.</w:t>
-      </w:r>
-    </w:p>
-    <w:p>
-      <w:pPr>
-        <w:tabs>
-          <w:tab w:val="left" w:pos="869"/>
-        </w:tabs>
-        <w:spacing w:after="0"/>
-        <w:rPr>
-          <w:rFonts w:hint="default" w:asciiTheme="minorBidi" w:hAnsiTheme="minorBidi"/>
-          <w:color w:val="FF0000"/>
-          <w:szCs w:val="24"/>
-          <w:lang w:val="en-US"/>
-        </w:rPr>
-      </w:pPr>
-      <w:r>
-        <w:rPr>
-          <w:rFonts w:hint="default" w:asciiTheme="minorBidi" w:hAnsiTheme="minorBidi"/>
-          <w:color w:val="FF0000"/>
-          <w:szCs w:val="24"/>
-          <w:lang w:val="en-US"/>
-        </w:rPr>
-        <w:t xml:space="preserve">3. </w:t>
       </w:r>
     </w:p>
     <w:p>
@@ -21049,7 +21000,8 @@
           <w:szCs w:val="24"/>
           <w:lang w:val="en-US"/>
         </w:rPr>
-        <w:t xml:space="preserve">   python run.py</w:t>
+        <w:tab/>
+        <w:t>python run.py</w:t>
       </w:r>
     </w:p>
     <w:p>
@@ -21072,7 +21024,8 @@
           <w:szCs w:val="24"/>
           <w:lang w:val="en-US"/>
         </w:rPr>
-        <w:t xml:space="preserve">   The server will run on http://localhost:5000.</w:t>
+        <w:tab/>
+        <w:t>The server will run on http://localhost:5000.</w:t>
       </w:r>
     </w:p>
     <w:p>
@@ -21235,6 +21188,8 @@
         </w:rPr>
         <w:t>5. When a scan finishes, click to transition the room from Scanning to Cleaning, and then from Cleaning to Idle to make it available for the next patient.</w:t>
       </w:r>
+      <w:bookmarkStart w:id="91" w:name="_GoBack"/>
+      <w:bookmarkEnd w:id="91"/>
     </w:p>
     <w:p>
       <w:pPr>
@@ -21249,6 +21204,15 @@
           <w:lang w:val="en-US"/>
         </w:rPr>
       </w:pPr>
+      <w:r>
+        <w:rPr>
+          <w:rFonts w:hint="default" w:asciiTheme="minorBidi" w:hAnsiTheme="minorBidi"/>
+          <w:color w:val="FF0000"/>
+          <w:szCs w:val="24"/>
+          <w:lang w:val="en-US"/>
+        </w:rPr>
+        <w:t>Step 5: Analytics and Settings</w:t>
+      </w:r>
     </w:p>
     <w:p>
       <w:pPr>
@@ -21270,7 +21234,7 @@
           <w:szCs w:val="24"/>
           <w:lang w:val="en-US"/>
         </w:rPr>
-        <w:t>Step 5: Analytics and Settings</w:t>
+        <w:t>1. Go to the Performance section to review room utilization, average scan durations, and download reports.</w:t>
       </w:r>
     </w:p>
     <w:p>
@@ -21293,7 +21257,7 @@
           <w:szCs w:val="24"/>
           <w:lang w:val="en-US"/>
         </w:rPr>
-        <w:t>1. Go to the Performance section to review room utilization, average scan durations, and download reports.</w:t>
+        <w:t>2. Go to the Settings section to update your profile name, email, change passwords, and configure your preferred layout language (English/Arabic).</w:t>
       </w:r>
     </w:p>
     <w:p>
@@ -21309,29 +21273,6 @@
           <w:lang w:val="en-US"/>
         </w:rPr>
       </w:pPr>
-      <w:r>
-        <w:rPr>
-          <w:rFonts w:hint="default" w:asciiTheme="minorBidi" w:hAnsiTheme="minorBidi"/>
-          <w:color w:val="FF0000"/>
-          <w:szCs w:val="24"/>
-          <w:lang w:val="en-US"/>
-        </w:rPr>
-        <w:t>2. Go to the Settings section to update your profile name, email, change passwords, and configure your preferred layout language (English/Arabic).</w:t>
-      </w:r>
-    </w:p>
-    <w:p>
-      <w:pPr>
-        <w:tabs>
-          <w:tab w:val="left" w:pos="869"/>
-        </w:tabs>
-        <w:spacing w:after="0"/>
-        <w:rPr>
-          <w:rFonts w:hint="default" w:asciiTheme="minorBidi" w:hAnsiTheme="minorBidi"/>
-          <w:color w:val="FF0000"/>
-          <w:szCs w:val="24"/>
-          <w:lang w:val="en-US"/>
-        </w:rPr>
-      </w:pPr>
     </w:p>
     <w:p>
       <w:pPr>
@@ -21343,8 +21284,8 @@
           <w:lang w:val="en-US"/>
         </w:rPr>
       </w:pPr>
-      <w:bookmarkStart w:id="89" w:name="_Toc269145131"/>
-      <w:bookmarkStart w:id="90" w:name="_Toc177830861"/>
+      <w:bookmarkStart w:id="89" w:name="_Toc177830861"/>
+      <w:bookmarkStart w:id="90" w:name="_Toc269145131"/>
       <w:r>
         <w:rPr>
           <w:b/>

</xml_diff>